<commit_message>
Fix portable UAV doc export and Diff-planner path
</commit_message>
<xml_diff>
--- a/docs/非凸α-开发者文档包.docx
+++ b/docs/非凸α-开发者文档包.docx
@@ -1524,6 +1524,41 @@
       </w:pPr>
       <w:r>
         <w:t>开发导航页</w:t>
+      </w:r>
+    </w:p>
+    <w:p/>
+    <w:p>
+      <w:pPr>
+        <w:pStyle w:val="Heading2"/>
+      </w:pPr>
+      <w:r>
+        <w:t>先怎么看这些交付件</w:t>
+      </w:r>
+    </w:p>
+    <w:p/>
+    <w:p>
+      <w:r>
+        <w:t>1. 优先打开 `非凸α-二开速查台.html`，先按“场景入口”“当前已部署”“推荐接口”理解当前机器主链和接入方式。</w:t>
+      </w:r>
+    </w:p>
+    <w:p>
+      <w:r>
+        <w:t>2. 再看 `非凸α-开发者文档包.docx` 的“机器现状总览”“当前已部署功能清单”“启动链与运行链”，把边界和运行链补全。</w:t>
+      </w:r>
+    </w:p>
+    <w:p>
+      <w:r>
+        <w:t>3. 再打开 `非凸α-接口总表.xlsx`，先读 `怎么用`、`场景速查` 和 `推荐接入`，不要直接扎进 `完整原表`。</w:t>
+      </w:r>
+    </w:p>
+    <w:p>
+      <w:r>
+        <w:t>4. 再打开 `非凸α-功能部署矩阵.xlsx`，先读 `怎么用` 和 `当前已部署`，把当前机器能直接接的功能和后续扩展分开。</w:t>
+      </w:r>
+    </w:p>
+    <w:p>
+      <w:r>
+        <w:t>5. 如果要补培训材料或日常速查图，再看 `非凸α-素材缺口表.xlsx`。</w:t>
       </w:r>
     </w:p>
     <w:p/>

</xml_diff>